<commit_message>
oh god quick add it all
</commit_message>
<xml_diff>
--- a/The Report/Main Report.docx
+++ b/The Report/Main Report.docx
@@ -17,7 +17,7 @@
           <w:sz w:val="72"/>
           <w:szCs w:val="72"/>
         </w:rPr>
-        <w:t>Marvellous Meal Maker</w:t>
+        <w:t>Marvelous Meal Maker</w:t>
       </w:r>
       <w:bookmarkEnd w:id="0"/>
     </w:p>
@@ -124,7 +124,7 @@
                 <w:rStyle w:val="Hyperlink"/>
                 <w:noProof/>
               </w:rPr>
-              <w:t>Marvellous Meal Maker</w:t>
+              <w:t>Marvelous Meal Maker</w:t>
             </w:r>
             <w:r>
               <w:rPr>
@@ -2388,7 +2388,15 @@
     </w:p>
     <w:p>
       <w:r>
-        <w:t>My target audience will be people who would use the Cookwell phone application, so approximately 20 to 30 year olds.</w:t>
+        <w:t xml:space="preserve">My target audience will be people who would use the Cookwell phone application, so approximately </w:t>
+      </w:r>
+      <w:proofErr w:type="gramStart"/>
+      <w:r>
+        <w:t>20 to 30 year olds</w:t>
+      </w:r>
+      <w:proofErr w:type="gramEnd"/>
+      <w:r>
+        <w:t>.</w:t>
       </w:r>
     </w:p>
     <w:p>
@@ -2828,23 +2836,199 @@
         <w:t>.</w:t>
       </w:r>
     </w:p>
+    <w:p>
+      <w:pPr>
+        <w:pStyle w:val="Heading2"/>
+      </w:pPr>
+      <w:r>
+        <w:lastRenderedPageBreak/>
+        <w:t>3.2.1 Decompose the problem</w:t>
+      </w:r>
+    </w:p>
+    <w:p>
+      <w:r>
+        <w:t>Decomposition of the problem will be found minutely in the Github repo for the Marvelous Meal Maker</w:t>
+      </w:r>
+      <w:r>
+        <w:t xml:space="preserve"> (</w:t>
+      </w:r>
+      <w:hyperlink r:id="rId10" w:history="1">
+        <w:r>
+          <w:rPr>
+            <w:rStyle w:val="Hyperlink"/>
+          </w:rPr>
+          <w:t>https://github.com/Je</w:t>
+        </w:r>
+        <w:r>
+          <w:rPr>
+            <w:rStyle w:val="Hyperlink"/>
+          </w:rPr>
+          <w:t>s</w:t>
+        </w:r>
+        <w:r>
+          <w:rPr>
+            <w:rStyle w:val="Hyperlink"/>
+          </w:rPr>
+          <w:t>sHorserage/Marvellous-Meal-Maker/issues</w:t>
+        </w:r>
+      </w:hyperlink>
+      <w:r>
+        <w:t>)</w:t>
+      </w:r>
+      <w:r>
+        <w:t>, in the issues tab specifically</w:t>
+      </w:r>
+      <w:r>
+        <w:t>, as well as a general decomposition here</w:t>
+      </w:r>
+      <w:r>
+        <w:t>.</w:t>
+      </w:r>
+    </w:p>
+    <w:p>
+      <w:r>
+        <w:t>At the base as a productivity tool, I am using Git Bash to update my report and programming files onto the GitHub where the files lie.</w:t>
+      </w:r>
+      <w:r>
+        <w:t xml:space="preserve"> Python</w:t>
+      </w:r>
+      <w:r>
+        <w:t xml:space="preserve"> will be used as I am already fairly well acquainted with the programming software, it also being chosen due to </w:t>
+      </w:r>
+      <w:proofErr w:type="spellStart"/>
+      <w:proofErr w:type="gramStart"/>
+      <w:r>
+        <w:t>it’s</w:t>
+      </w:r>
+      <w:proofErr w:type="spellEnd"/>
+      <w:proofErr w:type="gramEnd"/>
+      <w:r>
+        <w:t xml:space="preserve"> flexibility in procedural and object orientated design, </w:t>
+      </w:r>
+      <w:proofErr w:type="gramStart"/>
+      <w:r>
+        <w:t>it’s</w:t>
+      </w:r>
+      <w:proofErr w:type="gramEnd"/>
+      <w:r>
+        <w:t xml:space="preserve"> extensive documentation, </w:t>
+      </w:r>
+      <w:r>
+        <w:t xml:space="preserve">wide use, </w:t>
+      </w:r>
+      <w:r>
+        <w:t xml:space="preserve">the fact that it’s </w:t>
+      </w:r>
+      <w:r>
+        <w:t xml:space="preserve">currently updated, wide library support, ease of use, </w:t>
+      </w:r>
+      <w:r>
+        <w:t>general efficiency in prototyping and development</w:t>
+      </w:r>
+      <w:r>
+        <w:t xml:space="preserve">. </w:t>
+      </w:r>
+      <w:r>
+        <w:t xml:space="preserve">I will also choose to use </w:t>
+      </w:r>
+      <w:r>
+        <w:t>Databasing software</w:t>
+      </w:r>
+      <w:r>
+        <w:t xml:space="preserve"> as I feel like this would be required for certain specific elements of my program, specifically the first two modules, the digital pantry and the methodology list</w:t>
+      </w:r>
+      <w:r>
+        <w:t>.</w:t>
+      </w:r>
+    </w:p>
+    <w:p>
+      <w:r>
+        <w:t>The</w:t>
+      </w:r>
+      <w:r>
+        <w:t xml:space="preserve"> prominent</w:t>
+      </w:r>
+      <w:r>
+        <w:t xml:space="preserve"> algorithm</w:t>
+      </w:r>
+      <w:r>
+        <w:t xml:space="preserve"> that will be required for this project will be the</w:t>
+      </w:r>
+      <w:r>
+        <w:t xml:space="preserve"> </w:t>
+      </w:r>
+      <w:r>
+        <w:t>lynchpin algorithm</w:t>
+      </w:r>
+      <w:r>
+        <w:t>, placed last in construction.</w:t>
+      </w:r>
+      <w:r>
+        <w:t xml:space="preserve"> It will break down days down into time slots, </w:t>
+      </w:r>
+      <w:r>
+        <w:t xml:space="preserve">and allocate meals to have in certain days, whilst remembering both a long term </w:t>
+      </w:r>
+      <w:proofErr w:type="gramStart"/>
+      <w:r>
+        <w:t>28 day</w:t>
+      </w:r>
+      <w:proofErr w:type="gramEnd"/>
+      <w:r>
+        <w:t xml:space="preserve"> memory and a </w:t>
+      </w:r>
+      <w:proofErr w:type="gramStart"/>
+      <w:r>
+        <w:t>short term</w:t>
+      </w:r>
+      <w:proofErr w:type="gramEnd"/>
+      <w:r>
+        <w:t xml:space="preserve"> weekly memory, in relation to </w:t>
+      </w:r>
+      <w:r>
+        <w:t>things that have already been eaten.</w:t>
+      </w:r>
+      <w:r>
+        <w:t xml:space="preserve"> Also includes a submodule for handling shopping list additions, </w:t>
+      </w:r>
+      <w:r>
+        <w:t>and expiry dates factoring into the larger algorithm as a whole.</w:t>
+      </w:r>
+      <w:r>
+        <w:t xml:space="preserve"> </w:t>
+      </w:r>
+      <w:r>
+        <w:t>A small search algorithm will be used in case the user would like to look at specific entries in the pantry or list.</w:t>
+      </w:r>
+      <w:r>
+        <w:t xml:space="preserve"> AMMEND THIS WITH FUTURE ALGORITHM REQUIREMENTS.</w:t>
+      </w:r>
+    </w:p>
+    <w:p>
+      <w:r>
+        <w:t>WE ARE ON THE THIRD BULLET POINT.</w:t>
+      </w:r>
+    </w:p>
+    <w:p>
+      <w:pPr>
+        <w:pStyle w:val="Heading2"/>
+      </w:pPr>
+      <w:r>
+        <w:t xml:space="preserve">3.2.2 </w:t>
+      </w:r>
+    </w:p>
     <w:p/>
     <w:p>
-      <w:pPr>
-        <w:pStyle w:val="Heading2"/>
-      </w:pPr>
-      <w:r>
-        <w:lastRenderedPageBreak/>
-        <w:t xml:space="preserve">LOOK AT HEURISTICS/FUZZY LOGIC FOR </w:t>
-      </w:r>
-      <w:r>
-        <w:t>Heuristic Variant Collapser</w:t>
-      </w:r>
-    </w:p>
-    <w:p/>
-    <w:p>
-      <w:r>
-        <w:t>Weekly planner write up</w:t>
+      <w:r>
+        <w:t xml:space="preserve">Weekly </w:t>
+      </w:r>
+      <w:proofErr w:type="gramStart"/>
+      <w:r>
+        <w:t>planner</w:t>
+      </w:r>
+      <w:proofErr w:type="gramEnd"/>
+      <w:r>
+        <w:t xml:space="preserve"> write up</w:t>
       </w:r>
       <w:r>
         <w:t xml:space="preserve"> brainstorm</w:t>
@@ -2861,13 +3045,28 @@
     <w:p>
       <w:r>
         <w:tab/>
-        <w:t>28 day of last meals eaten</w:t>
+        <w:t xml:space="preserve">28 </w:t>
+      </w:r>
+      <w:proofErr w:type="gramStart"/>
+      <w:r>
+        <w:t>day</w:t>
+      </w:r>
+      <w:proofErr w:type="gramEnd"/>
+      <w:r>
+        <w:t xml:space="preserve"> of last meals eaten</w:t>
       </w:r>
     </w:p>
     <w:p>
       <w:r>
         <w:tab/>
-        <w:t>1 week forward view</w:t>
+      </w:r>
+      <w:proofErr w:type="gramStart"/>
+      <w:r>
+        <w:t>1 week</w:t>
+      </w:r>
+      <w:proofErr w:type="gramEnd"/>
+      <w:r>
+        <w:t xml:space="preserve"> forward view</w:t>
       </w:r>
     </w:p>
     <w:p>
@@ -2903,6 +3102,7 @@
     </w:p>
     <w:p>
       <w:r>
+        <w:lastRenderedPageBreak/>
         <w:tab/>
         <w:t>** API pulled suggested meals we want to keep</w:t>
       </w:r>
@@ -2937,18 +3137,47 @@
     <w:p/>
     <w:p>
       <w:r>
-        <w:t>If querying AI for the meals themselves how do we sense check results</w:t>
-      </w:r>
-    </w:p>
-    <w:p>
-      <w:r>
-        <w:t>Suggested meals missed are tracked and re-weighted and inserted in 1 week forward view</w:t>
-      </w:r>
-    </w:p>
-    <w:p>
-      <w:r>
-        <w:t>Meals missed on multiple occasions are flagged as unachievable?</w:t>
-      </w:r>
+        <w:t xml:space="preserve">If querying AI for the meals </w:t>
+      </w:r>
+      <w:proofErr w:type="gramStart"/>
+      <w:r>
+        <w:t>themselves</w:t>
+      </w:r>
+      <w:proofErr w:type="gramEnd"/>
+      <w:r>
+        <w:t xml:space="preserve"> how </w:t>
+      </w:r>
+      <w:proofErr w:type="gramStart"/>
+      <w:r>
+        <w:t>do</w:t>
+      </w:r>
+      <w:proofErr w:type="gramEnd"/>
+      <w:r>
+        <w:t xml:space="preserve"> we sense check results</w:t>
+      </w:r>
+    </w:p>
+    <w:p>
+      <w:r>
+        <w:t xml:space="preserve">Suggested meals missed are tracked and re-weighted and inserted in </w:t>
+      </w:r>
+      <w:proofErr w:type="gramStart"/>
+      <w:r>
+        <w:t>1 week</w:t>
+      </w:r>
+      <w:proofErr w:type="gramEnd"/>
+      <w:r>
+        <w:t xml:space="preserve"> forward view</w:t>
+      </w:r>
+    </w:p>
+    <w:p>
+      <w:r>
+        <w:t xml:space="preserve">Meals missed on multiple occasions are flagged as </w:t>
+      </w:r>
+      <w:proofErr w:type="gramStart"/>
+      <w:r>
+        <w:t>unachievable?</w:t>
+      </w:r>
+      <w:proofErr w:type="gramEnd"/>
     </w:p>
     <w:p>
       <w:r>
@@ -2984,7 +3213,7 @@
           <w:bCs/>
         </w:rPr>
       </w:pPr>
-      <w:hyperlink r:id="rId10" w:history="1">
+      <w:hyperlink r:id="rId11" w:history="1">
         <w:r>
           <w:rPr>
             <w:rStyle w:val="Hyperlink"/>
@@ -3007,8 +3236,8 @@
       </w:r>
     </w:p>
     <w:sectPr>
-      <w:headerReference w:type="default" r:id="rId11"/>
-      <w:footerReference w:type="default" r:id="rId12"/>
+      <w:headerReference w:type="default" r:id="rId12"/>
+      <w:footerReference w:type="default" r:id="rId13"/>
       <w:pgSz w:w="11906" w:h="16838"/>
       <w:pgMar w:top="1440" w:right="1440" w:bottom="1440" w:left="1440" w:header="567" w:footer="737" w:gutter="0"/>
       <w:cols w:space="708"/>

</xml_diff>